<commit_message>
Save hourly-resampled data, add references, export report to PDF
Add a notebook cell that saves the hourly-resampled dataset to
data/household_power_consumption_hourly.csv so it does not need to be
regenerated from the raw 2M-row file. Add References and Related Work
sections to the interim report citing the UCI dataset, the original
Transformer paper, the Informer paper, and two related projects that
forecast on the same household power dataset. Export the report to PDF.

Co-Authored-By: Claude Sonnet 5 <noreply@anthropic.com>
</commit_message>
<xml_diff>
--- a/report/Interim Report .docx
+++ b/report/Interim Report .docx
@@ -466,6 +466,94 @@
           <w:rFonts w:ascii="Times New Roman" w:hAnsi="Times New Roman" w:cs="Times New Roman"/>
         </w:rPr>
       </w:pPr>
+    </w:p>
+    <w:p/>
+    <w:p/>
+    <w:p>
+      <w:r>
+        <w:rPr>
+          <w:rFonts w:ascii="Times New Roman" w:hAnsi="Times New Roman"/>
+          <w:b/>
+        </w:rPr>
+        <w:t>Related Work</w:t>
+      </w:r>
+    </w:p>
+    <w:p>
+      <w:r>
+        <w:rPr>
+          <w:rFonts w:ascii="Times New Roman" w:hAnsi="Times New Roman"/>
+        </w:rPr>
+        <w:t>Prior work has applied deep learning to household electricity forecasting on this same UCI dataset: Saad Saoud et al. (2022) proposed a cascaded hybrid deep learning architecture for multistep household energy consumption forecasting, and public implementations such as the LSTM-Transformer hybrid by Sanjeevmax6 (n.d.) combine recurrent and self-attention layers for electric energy forecasting. More broadly, the self-attention Transformer architecture was introduced by Vaswani et al. (2017) and later extended for long-sequence time-series forecasting by Zhou et al. (2021) through the Informer architecture. Building on this literature, our project applies a compact, self-attention-only Transformer directly to hourly-resampled household power consumption data, rather than a hybrid recurrent-attention model or a long-horizon variant, to evaluate whether a lightweight Transformer can capture short-term household consumption patterns.</w:t>
+      </w:r>
+    </w:p>
+    <w:p>
+      <w:r>
+        <w:rPr>
+          <w:rFonts w:ascii="Times New Roman" w:hAnsi="Times New Roman"/>
+          <w:b/>
+        </w:rPr>
+        <w:t>References</w:t>
+      </w:r>
+    </w:p>
+    <w:p>
+      <w:pPr>
+        <w:spacing w:after="160"/>
+        <w:ind w:left="720" w:hanging="720"/>
+      </w:pPr>
+      <w:r>
+        <w:rPr>
+          <w:rFonts w:ascii="Times New Roman" w:hAnsi="Times New Roman"/>
+        </w:rPr>
+        <w:t>Hebrail, G., &amp; Berard, A. (2006). Individual household electric power consumption [Dataset]. UCI Machine Learning Repository. https://doi.org/10.24432/C58K54</w:t>
+      </w:r>
+    </w:p>
+    <w:p>
+      <w:pPr>
+        <w:spacing w:after="160"/>
+        <w:ind w:left="720" w:hanging="720"/>
+      </w:pPr>
+      <w:r>
+        <w:rPr>
+          <w:rFonts w:ascii="Times New Roman" w:hAnsi="Times New Roman"/>
+        </w:rPr>
+        <w:t>Vaswani, A., Shazeer, N., Parmar, N., Uszkoreit, J., Jones, L., Gomez, A. N., Kaiser, L., &amp; Polosukhin, I. (2017). Attention is all you need. Advances in Neural Information Processing Systems, 30.</w:t>
+      </w:r>
+    </w:p>
+    <w:p>
+      <w:pPr>
+        <w:spacing w:after="160"/>
+        <w:ind w:left="720" w:hanging="720"/>
+      </w:pPr>
+      <w:r>
+        <w:rPr>
+          <w:rFonts w:ascii="Times New Roman" w:hAnsi="Times New Roman"/>
+        </w:rPr>
+        <w:t>Zhou, H., Zhang, S., Peng, J., Zhang, S., Li, J., Xiong, H., &amp; Zhang, W. (2021). Informer: Beyond efficient transformer for long sequence time-series forecasting. Proceedings of the AAAI Conference on Artificial Intelligence, 35(12), 11106–11115. https://doi.org/10.1609/aaai.v35i12.17325</w:t>
+      </w:r>
+    </w:p>
+    <w:p>
+      <w:pPr>
+        <w:spacing w:after="160"/>
+        <w:ind w:left="720" w:hanging="720"/>
+      </w:pPr>
+      <w:r>
+        <w:rPr>
+          <w:rFonts w:ascii="Times New Roman" w:hAnsi="Times New Roman"/>
+        </w:rPr>
+        <w:t>Saad Saoud, L., AlMarzouqi, H., &amp; Hussein, R. (2022). Cascaded deep hybrid models for multistep household energy consumption forecasting. arXiv. https://arxiv.org/abs/2207.02589</w:t>
+      </w:r>
+    </w:p>
+    <w:p>
+      <w:pPr>
+        <w:spacing w:after="160"/>
+        <w:ind w:left="720" w:hanging="720"/>
+      </w:pPr>
+      <w:r>
+        <w:rPr>
+          <w:rFonts w:ascii="Times New Roman" w:hAnsi="Times New Roman"/>
+        </w:rPr>
+        <w:t>Sanjeevmax6. (n.d.). Electric energy forecasting: A hybrid LSTM-Transformer [Source code]. GitHub. https://github.com/sanjeevmax6/Electric-Energy-Forecasting-A-Hybrid-LSTM-Transformer-</w:t>
+      </w:r>
     </w:p>
     <w:sectPr>
       <w:pgSz w:w="12240" w:h="15840"/>

</xml_diff>

<commit_message>
Add persistence baseline comparison and dataset link to report
Add a persistence (naive) baseline cell to the notebook, matching the
formula used on fix-leakage-baseline-hyperopt-tuning, computed by
reusing the existing test_predictions.csv and lightweight preprocessing
rather than retraining the model. The Transformer beats the baseline by
13.83% MAE / 19.17% RMSE. Add this comparison, a results table, and a
Dataset link to the interim report to strengthen the performance and
presentation criteria.

Co-Authored-By: Claude Sonnet 5 <noreply@anthropic.com>
</commit_message>
<xml_diff>
--- a/report/Interim Report .docx
+++ b/report/Interim Report .docx
@@ -77,6 +77,31 @@
     </w:p>
     <w:p>
       <w:pPr>
+        <w:jc w:val="left"/>
+      </w:pPr>
+      <w:r>
+        <w:rPr>
+          <w:rFonts w:ascii="Times New Roman" w:hAnsi="Times New Roman"/>
+          <w:b/>
+        </w:rPr>
+        <w:t>Dataset:</w:t>
+      </w:r>
+    </w:p>
+    <w:p>
+      <w:pPr>
+        <w:jc w:val="left"/>
+      </w:pPr>
+      <w:r>
+        <w:rPr>
+          <w:rFonts w:ascii="Times New Roman" w:hAnsi="Times New Roman"/>
+          <w:color w:val="0000EE"/>
+          <w:u w:val="single"/>
+        </w:rPr>
+        <w:t>https://archive.ics.uci.edu/dataset/235/individual+household+electric+power+consumption</w:t>
+      </w:r>
+    </w:p>
+    <w:p>
+      <w:pPr>
         <w:rPr>
           <w:rFonts w:ascii="Times New Roman" w:hAnsi="Times New Roman" w:cs="Times New Roman"/>
         </w:rPr>
@@ -309,6 +334,237 @@
         </w:rPr>
       </w:pPr>
     </w:p>
+    <w:p>
+      <w:r>
+        <w:rPr>
+          <w:rFonts w:ascii="Times New Roman" w:hAnsi="Times New Roman"/>
+        </w:rPr>
+        <w:t>To confirm the Transformer is learning genuine temporal structure rather than trivially tracking recent values, its performance was compared against a persistence (naive) baseline that predicts the next hour's global active power to equal the previous hour's actual value. The Transformer reduces MAE by 13.83% and RMSE by 19.17% relative to this baseline (Table 1), indicating that the model captures temporal patterns beyond simple hour-to-hour carryover.</w:t>
+      </w:r>
+    </w:p>
+    <w:p>
+      <w:pPr>
+        <w:jc w:val="center"/>
+      </w:pPr>
+      <w:r>
+        <w:rPr>
+          <w:rFonts w:ascii="Times New Roman" w:hAnsi="Times New Roman"/>
+          <w:i/>
+        </w:rPr>
+        <w:t>Table 1: Test-set performance vs. persistence baseline</w:t>
+      </w:r>
+    </w:p>
+    <w:tbl>
+      <w:tblPr>
+        <w:tblW w:type="auto" w:w="0"/>
+        <w:tblLook w:firstColumn="1" w:firstRow="1" w:lastColumn="0" w:lastRow="0" w:noHBand="0" w:noVBand="1" w:val="04A0"/>
+        <w:tblBorders>
+          <w:top w:val="single" w:sz="4" w:space="0" w:color="000000"/>
+          <w:left w:val="single" w:sz="4" w:space="0" w:color="000000"/>
+          <w:bottom w:val="single" w:sz="4" w:space="0" w:color="000000"/>
+          <w:right w:val="single" w:sz="4" w:space="0" w:color="000000"/>
+          <w:insideH w:val="single" w:sz="4" w:space="0" w:color="000000"/>
+          <w:insideV w:val="single" w:sz="4" w:space="0" w:color="000000"/>
+        </w:tblBorders>
+      </w:tblPr>
+      <w:tblGrid>
+        <w:gridCol w:w="2340"/>
+        <w:gridCol w:w="2340"/>
+        <w:gridCol w:w="2340"/>
+        <w:gridCol w:w="2340"/>
+      </w:tblGrid>
+      <w:tr>
+        <w:tc>
+          <w:tcPr>
+            <w:tcW w:type="dxa" w:w="2340"/>
+          </w:tcPr>
+          <w:p>
+            <w:r/>
+            <w:r>
+              <w:rPr>
+                <w:rFonts w:ascii="Times New Roman" w:hAnsi="Times New Roman"/>
+                <w:b/>
+                <w:sz w:val="22"/>
+              </w:rPr>
+              <w:t>Model</w:t>
+            </w:r>
+          </w:p>
+        </w:tc>
+        <w:tc>
+          <w:tcPr>
+            <w:tcW w:type="dxa" w:w="2340"/>
+          </w:tcPr>
+          <w:p>
+            <w:r/>
+            <w:r>
+              <w:rPr>
+                <w:rFonts w:ascii="Times New Roman" w:hAnsi="Times New Roman"/>
+                <w:b/>
+                <w:sz w:val="22"/>
+              </w:rPr>
+              <w:t>MAE</w:t>
+            </w:r>
+          </w:p>
+        </w:tc>
+        <w:tc>
+          <w:tcPr>
+            <w:tcW w:type="dxa" w:w="2340"/>
+          </w:tcPr>
+          <w:p>
+            <w:r/>
+            <w:r>
+              <w:rPr>
+                <w:rFonts w:ascii="Times New Roman" w:hAnsi="Times New Roman"/>
+                <w:b/>
+                <w:sz w:val="22"/>
+              </w:rPr>
+              <w:t>MSE</w:t>
+            </w:r>
+          </w:p>
+        </w:tc>
+        <w:tc>
+          <w:tcPr>
+            <w:tcW w:type="dxa" w:w="2340"/>
+          </w:tcPr>
+          <w:p>
+            <w:r/>
+            <w:r>
+              <w:rPr>
+                <w:rFonts w:ascii="Times New Roman" w:hAnsi="Times New Roman"/>
+                <w:b/>
+                <w:sz w:val="22"/>
+              </w:rPr>
+              <w:t>RMSE</w:t>
+            </w:r>
+          </w:p>
+        </w:tc>
+      </w:tr>
+      <w:tr>
+        <w:tc>
+          <w:tcPr>
+            <w:tcW w:type="dxa" w:w="2340"/>
+          </w:tcPr>
+          <w:p>
+            <w:r/>
+            <w:r>
+              <w:rPr>
+                <w:rFonts w:ascii="Times New Roman" w:hAnsi="Times New Roman"/>
+                <w:sz w:val="22"/>
+              </w:rPr>
+              <w:t>Transformer (ours)</w:t>
+            </w:r>
+          </w:p>
+        </w:tc>
+        <w:tc>
+          <w:tcPr>
+            <w:tcW w:type="dxa" w:w="2340"/>
+          </w:tcPr>
+          <w:p>
+            <w:r/>
+            <w:r>
+              <w:rPr>
+                <w:rFonts w:ascii="Times New Roman" w:hAnsi="Times New Roman"/>
+                <w:sz w:val="22"/>
+              </w:rPr>
+              <w:t>0.3208</w:t>
+            </w:r>
+          </w:p>
+        </w:tc>
+        <w:tc>
+          <w:tcPr>
+            <w:tcW w:type="dxa" w:w="2340"/>
+          </w:tcPr>
+          <w:p>
+            <w:r/>
+            <w:r>
+              <w:rPr>
+                <w:rFonts w:ascii="Times New Roman" w:hAnsi="Times New Roman"/>
+                <w:sz w:val="22"/>
+              </w:rPr>
+              <w:t>0.2156</w:t>
+            </w:r>
+          </w:p>
+        </w:tc>
+        <w:tc>
+          <w:tcPr>
+            <w:tcW w:type="dxa" w:w="2340"/>
+          </w:tcPr>
+          <w:p>
+            <w:r/>
+            <w:r>
+              <w:rPr>
+                <w:rFonts w:ascii="Times New Roman" w:hAnsi="Times New Roman"/>
+                <w:sz w:val="22"/>
+              </w:rPr>
+              <w:t>0.4643</w:t>
+            </w:r>
+          </w:p>
+        </w:tc>
+      </w:tr>
+      <w:tr>
+        <w:tc>
+          <w:tcPr>
+            <w:tcW w:type="dxa" w:w="2340"/>
+          </w:tcPr>
+          <w:p>
+            <w:r/>
+            <w:r>
+              <w:rPr>
+                <w:rFonts w:ascii="Times New Roman" w:hAnsi="Times New Roman"/>
+                <w:sz w:val="22"/>
+              </w:rPr>
+              <w:t>Persistence baseline</w:t>
+            </w:r>
+          </w:p>
+        </w:tc>
+        <w:tc>
+          <w:tcPr>
+            <w:tcW w:type="dxa" w:w="2340"/>
+          </w:tcPr>
+          <w:p>
+            <w:r/>
+            <w:r>
+              <w:rPr>
+                <w:rFonts w:ascii="Times New Roman" w:hAnsi="Times New Roman"/>
+                <w:sz w:val="22"/>
+              </w:rPr>
+              <w:t>0.3723</w:t>
+            </w:r>
+          </w:p>
+        </w:tc>
+        <w:tc>
+          <w:tcPr>
+            <w:tcW w:type="dxa" w:w="2340"/>
+          </w:tcPr>
+          <w:p>
+            <w:r/>
+            <w:r>
+              <w:rPr>
+                <w:rFonts w:ascii="Times New Roman" w:hAnsi="Times New Roman"/>
+                <w:sz w:val="22"/>
+              </w:rPr>
+              <w:t>0.3300</w:t>
+            </w:r>
+          </w:p>
+        </w:tc>
+        <w:tc>
+          <w:tcPr>
+            <w:tcW w:type="dxa" w:w="2340"/>
+          </w:tcPr>
+          <w:p>
+            <w:r/>
+            <w:r>
+              <w:rPr>
+                <w:rFonts w:ascii="Times New Roman" w:hAnsi="Times New Roman"/>
+                <w:sz w:val="22"/>
+              </w:rPr>
+              <w:t>0.5745</w:t>
+            </w:r>
+          </w:p>
+        </w:tc>
+      </w:tr>
+    </w:tbl>
+    <w:p/>
     <w:p>
       <w:pPr>
         <w:jc w:val="center"/>

</xml_diff>